<commit_message>
feat(main): update files lab02
</commit_message>
<xml_diff>
--- a/labs/lab02/report/lab02--report.docx
+++ b/labs/lab02/report/lab02--report.docx
@@ -118,7 +118,7 @@
       </w:r>
     </w:p>
     <w:bookmarkEnd w:id="21"/>
-    <w:bookmarkStart w:id="38" w:name="выполнение-лабораторной-работы"/>
+    <w:bookmarkStart w:id="71" w:name="выполнение-лабораторной-работы"/>
     <w:p>
       <w:pPr>
         <w:pStyle w:val="Heading1"/>
@@ -135,32 +135,54 @@
         <w:t xml:space="preserve">Перед началом работы установим git и gh.</w:t>
       </w:r>
     </w:p>
-    <w:bookmarkStart w:id="22" w:name="Xdfe163345d338193ac2bdc183f8e9dcff904b43"/>
-    <w:tbl>
-      <w:tblPr>
-        <w:tblStyle w:val="FigureTable"/>
-        <w:tblW w:type="auto" w:w="0"/>
-        <w:jc w:val="center"/>
-        <w:tblLook w:firstRow="0" w:lastRow="0" w:firstColumn="0" w:lastColumn="0"/>
-      </w:tblPr>
-      <w:tblGrid>
-        <w:gridCol w:w="7920"/>
-      </w:tblGrid>
-      <w:tr>
-        <w:tc>
-          <w:tcPr/>
-          <w:p>
-            <w:pPr>
-              <w:pStyle w:val="Compact"/>
-              <w:jc w:val="center"/>
-            </w:pPr>
-            <w:r>
-              <w:t xml:space="preserve">Установка git и gh.</w:t>
-            </w:r>
-          </w:p>
-        </w:tc>
-      </w:tr>
-    </w:tbl>
+    <w:bookmarkStart w:id="25" w:name="Xdfe163345d338193ac2bdc183f8e9dcff904b43"/>
+    <w:p>
+      <w:pPr>
+        <w:pStyle w:val="CaptionedFigure"/>
+      </w:pPr>
+      <w:r>
+        <w:drawing>
+          <wp:inline>
+            <wp:extent cx="2658675" cy="1782695"/>
+            <wp:effectExtent b="0" l="0" r="0" t="0"/>
+            <wp:docPr descr="Установка git и gh." title="" id="23" name="Picture"/>
+            <a:graphic>
+              <a:graphicData uri="http://schemas.openxmlformats.org/drawingml/2006/picture">
+                <pic:pic>
+                  <pic:nvPicPr>
+                    <pic:cNvPr descr="image/Shot01.png" id="24" name="Picture"/>
+                    <pic:cNvPicPr>
+                      <a:picLocks noChangeArrowheads="1" noChangeAspect="1"/>
+                    </pic:cNvPicPr>
+                  </pic:nvPicPr>
+                  <pic:blipFill>
+                    <a:blip r:embed="rId22"/>
+                    <a:stretch>
+                      <a:fillRect/>
+                    </a:stretch>
+                  </pic:blipFill>
+                  <pic:spPr bwMode="auto">
+                    <a:xfrm>
+                      <a:off x="0" y="0"/>
+                      <a:ext cx="2658675" cy="1782695"/>
+                    </a:xfrm>
+                    <a:prstGeom prst="rect">
+                      <a:avLst/>
+                    </a:prstGeom>
+                    <a:noFill/>
+                    <a:ln w="9525">
+                      <a:noFill/>
+                      <a:headEnd/>
+                      <a:tailEnd/>
+                    </a:ln>
+                  </pic:spPr>
+                </pic:pic>
+              </a:graphicData>
+            </a:graphic>
+          </wp:inline>
+        </w:drawing>
+      </w:r>
+    </w:p>
     <w:p>
       <w:pPr>
         <w:pStyle w:val="ImageCaption"/>
@@ -169,7 +191,7 @@
         <w:t xml:space="preserve">Установка git и gh.</w:t>
       </w:r>
     </w:p>
-    <w:bookmarkEnd w:id="22"/>
+    <w:bookmarkEnd w:id="25"/>
     <w:p>
       <w:pPr>
         <w:pStyle w:val="BodyText"/>
@@ -178,32 +200,54 @@
         <w:t xml:space="preserve">Теперь настроим git. Заданим имя и email владельца, настроим вывод сообщений, зададим имя начальной ветки и изменим пару параметров.</w:t>
       </w:r>
     </w:p>
-    <w:bookmarkStart w:id="23" w:name="Xcac9d1d8eab3713ae489224d0130c9468e7a0e3"/>
-    <w:tbl>
-      <w:tblPr>
-        <w:tblStyle w:val="FigureTable"/>
-        <w:tblW w:type="auto" w:w="0"/>
-        <w:jc w:val="center"/>
-        <w:tblLook w:firstRow="0" w:lastRow="0" w:firstColumn="0" w:lastColumn="0"/>
-      </w:tblPr>
-      <w:tblGrid>
-        <w:gridCol w:w="7920"/>
-      </w:tblGrid>
-      <w:tr>
-        <w:tc>
-          <w:tcPr/>
-          <w:p>
-            <w:pPr>
-              <w:pStyle w:val="Compact"/>
-              <w:jc w:val="center"/>
-            </w:pPr>
-            <w:r>
-              <w:t xml:space="preserve">Базовая настройка git.</w:t>
-            </w:r>
-          </w:p>
-        </w:tc>
-      </w:tr>
-    </w:tbl>
+    <w:bookmarkStart w:id="29" w:name="Xcac9d1d8eab3713ae489224d0130c9468e7a0e3"/>
+    <w:p>
+      <w:pPr>
+        <w:pStyle w:val="CaptionedFigure"/>
+      </w:pPr>
+      <w:r>
+        <w:drawing>
+          <wp:inline>
+            <wp:extent cx="3733800" cy="714821"/>
+            <wp:effectExtent b="0" l="0" r="0" t="0"/>
+            <wp:docPr descr="Базовая настройка git." title="" id="27" name="Picture"/>
+            <a:graphic>
+              <a:graphicData uri="http://schemas.openxmlformats.org/drawingml/2006/picture">
+                <pic:pic>
+                  <pic:nvPicPr>
+                    <pic:cNvPr descr="image/Shot02.png" id="28" name="Picture"/>
+                    <pic:cNvPicPr>
+                      <a:picLocks noChangeArrowheads="1" noChangeAspect="1"/>
+                    </pic:cNvPicPr>
+                  </pic:nvPicPr>
+                  <pic:blipFill>
+                    <a:blip r:embed="rId26"/>
+                    <a:stretch>
+                      <a:fillRect/>
+                    </a:stretch>
+                  </pic:blipFill>
+                  <pic:spPr bwMode="auto">
+                    <a:xfrm>
+                      <a:off x="0" y="0"/>
+                      <a:ext cx="3733800" cy="714821"/>
+                    </a:xfrm>
+                    <a:prstGeom prst="rect">
+                      <a:avLst/>
+                    </a:prstGeom>
+                    <a:noFill/>
+                    <a:ln w="9525">
+                      <a:noFill/>
+                      <a:headEnd/>
+                      <a:tailEnd/>
+                    </a:ln>
+                  </pic:spPr>
+                </pic:pic>
+              </a:graphicData>
+            </a:graphic>
+          </wp:inline>
+        </w:drawing>
+      </w:r>
+    </w:p>
     <w:p>
       <w:pPr>
         <w:pStyle w:val="ImageCaption"/>
@@ -212,7 +256,7 @@
         <w:t xml:space="preserve">Базовая настройка git.</w:t>
       </w:r>
     </w:p>
-    <w:bookmarkEnd w:id="23"/>
+    <w:bookmarkEnd w:id="29"/>
     <w:p>
       <w:pPr>
         <w:pStyle w:val="BodyText"/>
@@ -230,32 +274,54 @@
         <w:t xml:space="preserve">. Создадим ключи по алгоритмам rsa и ed25519.</w:t>
       </w:r>
     </w:p>
-    <w:bookmarkStart w:id="24" w:name="Xea6c91e241f256e5e3a88ebd647372022323a53"/>
-    <w:tbl>
-      <w:tblPr>
-        <w:tblStyle w:val="FigureTable"/>
-        <w:tblW w:type="auto" w:w="0"/>
-        <w:jc w:val="center"/>
-        <w:tblLook w:firstRow="0" w:lastRow="0" w:firstColumn="0" w:lastColumn="0"/>
-      </w:tblPr>
-      <w:tblGrid>
-        <w:gridCol w:w="7920"/>
-      </w:tblGrid>
-      <w:tr>
-        <w:tc>
-          <w:tcPr/>
-          <w:p>
-            <w:pPr>
-              <w:pStyle w:val="Compact"/>
-              <w:jc w:val="center"/>
-            </w:pPr>
-            <w:r>
-              <w:t xml:space="preserve">Создание ключа по алгоритму ed25519.</w:t>
-            </w:r>
-          </w:p>
-        </w:tc>
-      </w:tr>
-    </w:tbl>
+    <w:bookmarkStart w:id="33" w:name="Xea6c91e241f256e5e3a88ebd647372022323a53"/>
+    <w:p>
+      <w:pPr>
+        <w:pStyle w:val="CaptionedFigure"/>
+      </w:pPr>
+      <w:r>
+        <w:drawing>
+          <wp:inline>
+            <wp:extent cx="2420470" cy="315045"/>
+            <wp:effectExtent b="0" l="0" r="0" t="0"/>
+            <wp:docPr descr="Создание ключа по алгоритму ed25519." title="" id="31" name="Picture"/>
+            <a:graphic>
+              <a:graphicData uri="http://schemas.openxmlformats.org/drawingml/2006/picture">
+                <pic:pic>
+                  <pic:nvPicPr>
+                    <pic:cNvPr descr="image/Shot03.png" id="32" name="Picture"/>
+                    <pic:cNvPicPr>
+                      <a:picLocks noChangeArrowheads="1" noChangeAspect="1"/>
+                    </pic:cNvPicPr>
+                  </pic:nvPicPr>
+                  <pic:blipFill>
+                    <a:blip r:embed="rId30"/>
+                    <a:stretch>
+                      <a:fillRect/>
+                    </a:stretch>
+                  </pic:blipFill>
+                  <pic:spPr bwMode="auto">
+                    <a:xfrm>
+                      <a:off x="0" y="0"/>
+                      <a:ext cx="2420470" cy="315045"/>
+                    </a:xfrm>
+                    <a:prstGeom prst="rect">
+                      <a:avLst/>
+                    </a:prstGeom>
+                    <a:noFill/>
+                    <a:ln w="9525">
+                      <a:noFill/>
+                      <a:headEnd/>
+                      <a:tailEnd/>
+                    </a:ln>
+                  </pic:spPr>
+                </pic:pic>
+              </a:graphicData>
+            </a:graphic>
+          </wp:inline>
+        </w:drawing>
+      </w:r>
+    </w:p>
     <w:p>
       <w:pPr>
         <w:pStyle w:val="ImageCaption"/>
@@ -264,33 +330,55 @@
         <w:t xml:space="preserve">Создание ключа по алгоритму ed25519.</w:t>
       </w:r>
     </w:p>
-    <w:bookmarkEnd w:id="24"/>
-    <w:bookmarkStart w:id="25" w:name="X98f861ee74f6ff83ccbc9c53b419941d0080e50"/>
-    <w:tbl>
-      <w:tblPr>
-        <w:tblStyle w:val="FigureTable"/>
-        <w:tblW w:type="auto" w:w="0"/>
-        <w:jc w:val="center"/>
-        <w:tblLook w:firstRow="0" w:lastRow="0" w:firstColumn="0" w:lastColumn="0"/>
-      </w:tblPr>
-      <w:tblGrid>
-        <w:gridCol w:w="7920"/>
-      </w:tblGrid>
-      <w:tr>
-        <w:tc>
-          <w:tcPr/>
-          <w:p>
-            <w:pPr>
-              <w:pStyle w:val="Compact"/>
-              <w:jc w:val="center"/>
-            </w:pPr>
-            <w:r>
-              <w:t xml:space="preserve">Создание ключа по алгоритму rsa.</w:t>
-            </w:r>
-          </w:p>
-        </w:tc>
-      </w:tr>
-    </w:tbl>
+    <w:bookmarkEnd w:id="33"/>
+    <w:bookmarkStart w:id="37" w:name="X98f861ee74f6ff83ccbc9c53b419941d0080e50"/>
+    <w:p>
+      <w:pPr>
+        <w:pStyle w:val="CaptionedFigure"/>
+      </w:pPr>
+      <w:r>
+        <w:drawing>
+          <wp:inline>
+            <wp:extent cx="2351314" cy="315045"/>
+            <wp:effectExtent b="0" l="0" r="0" t="0"/>
+            <wp:docPr descr="Создание ключа по алгоритму rsa." title="" id="35" name="Picture"/>
+            <a:graphic>
+              <a:graphicData uri="http://schemas.openxmlformats.org/drawingml/2006/picture">
+                <pic:pic>
+                  <pic:nvPicPr>
+                    <pic:cNvPr descr="image/Shot04.png" id="36" name="Picture"/>
+                    <pic:cNvPicPr>
+                      <a:picLocks noChangeArrowheads="1" noChangeAspect="1"/>
+                    </pic:cNvPicPr>
+                  </pic:nvPicPr>
+                  <pic:blipFill>
+                    <a:blip r:embed="rId34"/>
+                    <a:stretch>
+                      <a:fillRect/>
+                    </a:stretch>
+                  </pic:blipFill>
+                  <pic:spPr bwMode="auto">
+                    <a:xfrm>
+                      <a:off x="0" y="0"/>
+                      <a:ext cx="2351314" cy="315045"/>
+                    </a:xfrm>
+                    <a:prstGeom prst="rect">
+                      <a:avLst/>
+                    </a:prstGeom>
+                    <a:noFill/>
+                    <a:ln w="9525">
+                      <a:noFill/>
+                      <a:headEnd/>
+                      <a:tailEnd/>
+                    </a:ln>
+                  </pic:spPr>
+                </pic:pic>
+              </a:graphicData>
+            </a:graphic>
+          </wp:inline>
+        </w:drawing>
+      </w:r>
+    </w:p>
     <w:p>
       <w:pPr>
         <w:pStyle w:val="ImageCaption"/>
@@ -299,7 +387,7 @@
         <w:t xml:space="preserve">Создание ключа по алгоритму rsa.</w:t>
       </w:r>
     </w:p>
-    <w:bookmarkEnd w:id="25"/>
+    <w:bookmarkEnd w:id="37"/>
     <w:p>
       <w:pPr>
         <w:pStyle w:val="BodyText"/>
@@ -317,32 +405,54 @@
         <w:t xml:space="preserve">.</w:t>
       </w:r>
     </w:p>
-    <w:bookmarkStart w:id="26" w:name="X8a5c2818590ee3c4d5d93a448190f3397144303"/>
-    <w:tbl>
-      <w:tblPr>
-        <w:tblStyle w:val="FigureTable"/>
-        <w:tblW w:type="auto" w:w="0"/>
-        <w:jc w:val="center"/>
-        <w:tblLook w:firstRow="0" w:lastRow="0" w:firstColumn="0" w:lastColumn="0"/>
-      </w:tblPr>
-      <w:tblGrid>
-        <w:gridCol w:w="7920"/>
-      </w:tblGrid>
-      <w:tr>
-        <w:tc>
-          <w:tcPr/>
-          <w:p>
-            <w:pPr>
-              <w:pStyle w:val="Compact"/>
-              <w:jc w:val="center"/>
-            </w:pPr>
-            <w:r>
-              <w:t xml:space="preserve">Создание ключа PGP.</w:t>
-            </w:r>
-          </w:p>
-        </w:tc>
-      </w:tr>
-    </w:tbl>
+    <w:bookmarkStart w:id="41" w:name="X8a5c2818590ee3c4d5d93a448190f3397144303"/>
+    <w:p>
+      <w:pPr>
+        <w:pStyle w:val="CaptionedFigure"/>
+      </w:pPr>
+      <w:r>
+        <w:drawing>
+          <wp:inline>
+            <wp:extent cx="3672968" cy="737667"/>
+            <wp:effectExtent b="0" l="0" r="0" t="0"/>
+            <wp:docPr descr="Создание ключа PGP." title="" id="39" name="Picture"/>
+            <a:graphic>
+              <a:graphicData uri="http://schemas.openxmlformats.org/drawingml/2006/picture">
+                <pic:pic>
+                  <pic:nvPicPr>
+                    <pic:cNvPr descr="image/Shot05.png" id="40" name="Picture"/>
+                    <pic:cNvPicPr>
+                      <a:picLocks noChangeArrowheads="1" noChangeAspect="1"/>
+                    </pic:cNvPicPr>
+                  </pic:nvPicPr>
+                  <pic:blipFill>
+                    <a:blip r:embed="rId38"/>
+                    <a:stretch>
+                      <a:fillRect/>
+                    </a:stretch>
+                  </pic:blipFill>
+                  <pic:spPr bwMode="auto">
+                    <a:xfrm>
+                      <a:off x="0" y="0"/>
+                      <a:ext cx="3672968" cy="737667"/>
+                    </a:xfrm>
+                    <a:prstGeom prst="rect">
+                      <a:avLst/>
+                    </a:prstGeom>
+                    <a:noFill/>
+                    <a:ln w="9525">
+                      <a:noFill/>
+                      <a:headEnd/>
+                      <a:tailEnd/>
+                    </a:ln>
+                  </pic:spPr>
+                </pic:pic>
+              </a:graphicData>
+            </a:graphic>
+          </wp:inline>
+        </w:drawing>
+      </w:r>
+    </w:p>
     <w:p>
       <w:pPr>
         <w:pStyle w:val="ImageCaption"/>
@@ -351,7 +461,7 @@
         <w:t xml:space="preserve">Создание ключа PGP.</w:t>
       </w:r>
     </w:p>
-    <w:bookmarkEnd w:id="26"/>
+    <w:bookmarkEnd w:id="41"/>
     <w:p>
       <w:pPr>
         <w:pStyle w:val="BodyText"/>
@@ -362,7 +472,7 @@
       <w:r>
         <w:t xml:space="preserve"> </w:t>
       </w:r>
-      <w:hyperlink r:id="rId27">
+      <w:hyperlink r:id="rId42">
         <w:r>
           <w:rPr>
             <w:rStyle w:val="Hyperlink"/>
@@ -382,240 +492,7 @@
         <w:t xml:space="preserve">Перейдём к добавлению PGP ключа в GitHub. Для начала выведем список ключей.</w:t>
       </w:r>
     </w:p>
-    <w:bookmarkStart w:id="28" w:name="X316b3d5fef9b3562d32f7c39f154a3bc3ab9c58"/>
-    <w:tbl>
-      <w:tblPr>
-        <w:tblStyle w:val="FigureTable"/>
-        <w:tblW w:type="auto" w:w="0"/>
-        <w:jc w:val="center"/>
-        <w:tblLook w:firstRow="0" w:lastRow="0" w:firstColumn="0" w:lastColumn="0"/>
-      </w:tblPr>
-      <w:tblGrid>
-        <w:gridCol w:w="7920"/>
-      </w:tblGrid>
-      <w:tr>
-        <w:tc>
-          <w:tcPr/>
-          <w:p>
-            <w:pPr>
-              <w:pStyle w:val="Compact"/>
-              <w:jc w:val="center"/>
-            </w:pPr>
-            <w:r>
-              <w:t xml:space="preserve">Команда вывода списка ключей.</w:t>
-            </w:r>
-          </w:p>
-        </w:tc>
-      </w:tr>
-    </w:tbl>
-    <w:p>
-      <w:pPr>
-        <w:pStyle w:val="ImageCaption"/>
-      </w:pPr>
-      <w:r>
-        <w:t xml:space="preserve">Команда вывода списка ключей.</w:t>
-      </w:r>
-    </w:p>
-    <w:bookmarkEnd w:id="28"/>
-    <w:p>
-      <w:pPr>
-        <w:pStyle w:val="BodyText"/>
-      </w:pPr>
-      <w:r>
-        <w:t xml:space="preserve">Скопируем ключ PGP с помощью</w:t>
-      </w:r>
-      <w:r>
-        <w:t xml:space="preserve"> </w:t>
-      </w:r>
-      <w:r>
-        <w:t xml:space="preserve">‘gpg –armor –export</w:t>
-      </w:r>
-      <w:r>
-        <w:t xml:space="preserve"> </w:t>
-      </w:r>
-      <w:r>
-        <w:t xml:space="preserve"> </w:t>
-      </w:r>
-      <w:r>
-        <w:t xml:space="preserve">| xclip -sel clip’</w:t>
-      </w:r>
-      <w:r>
-        <w:t xml:space="preserve">. Затем перейдём в настройки GitHub &gt; SSH and GPG keys &gt; New GPG key и вставим скопированный ключ.</w:t>
-      </w:r>
-    </w:p>
-    <w:bookmarkStart w:id="29" w:name="Xea51bf32497d1b3708522b430b288a129f65307"/>
-    <w:tbl>
-      <w:tblPr>
-        <w:tblStyle w:val="FigureTable"/>
-        <w:tblW w:type="auto" w:w="0"/>
-        <w:jc w:val="center"/>
-        <w:tblLook w:firstRow="0" w:lastRow="0" w:firstColumn="0" w:lastColumn="0"/>
-      </w:tblPr>
-      <w:tblGrid>
-        <w:gridCol w:w="7920"/>
-      </w:tblGrid>
-      <w:tr>
-        <w:tc>
-          <w:tcPr/>
-          <w:p>
-            <w:pPr>
-              <w:pStyle w:val="Compact"/>
-              <w:jc w:val="center"/>
-            </w:pPr>
-            <w:r>
-              <w:t xml:space="preserve">Добавление ключа на GitHub.</w:t>
-            </w:r>
-          </w:p>
-        </w:tc>
-      </w:tr>
-    </w:tbl>
-    <w:p>
-      <w:pPr>
-        <w:pStyle w:val="ImageCaption"/>
-      </w:pPr>
-      <w:r>
-        <w:t xml:space="preserve">Добавление ключа на GitHub.</w:t>
-      </w:r>
-    </w:p>
-    <w:bookmarkEnd w:id="29"/>
-    <w:p>
-      <w:pPr>
-        <w:pStyle w:val="BodyText"/>
-      </w:pPr>
-      <w:r>
-        <w:t xml:space="preserve">После добавления ключа настроим автоматические подписи коммитов. Укажем git применять наш email при подписи коммитов. После этого авторизуемся.</w:t>
-      </w:r>
-    </w:p>
-    <w:bookmarkStart w:id="30" w:name="Xb581cdce6283495fd4934ce574ac47e92881c64"/>
-    <w:tbl>
-      <w:tblPr>
-        <w:tblStyle w:val="FigureTable"/>
-        <w:tblW w:type="auto" w:w="0"/>
-        <w:jc w:val="center"/>
-        <w:tblLook w:firstRow="0" w:lastRow="0" w:firstColumn="0" w:lastColumn="0"/>
-      </w:tblPr>
-      <w:tblGrid>
-        <w:gridCol w:w="7920"/>
-      </w:tblGrid>
-      <w:tr>
-        <w:tc>
-          <w:tcPr/>
-          <w:p>
-            <w:pPr>
-              <w:pStyle w:val="Compact"/>
-              <w:jc w:val="center"/>
-            </w:pPr>
-            <w:r>
-              <w:t xml:space="preserve">Автоматические подписи и авторизация.</w:t>
-            </w:r>
-          </w:p>
-        </w:tc>
-      </w:tr>
-    </w:tbl>
-    <w:p>
-      <w:pPr>
-        <w:pStyle w:val="ImageCaption"/>
-      </w:pPr>
-      <w:r>
-        <w:t xml:space="preserve">Автоматические подписи и авторизация.</w:t>
-      </w:r>
-    </w:p>
-    <w:bookmarkEnd w:id="30"/>
-    <w:p>
-      <w:pPr>
-        <w:pStyle w:val="BodyText"/>
-      </w:pPr>
-      <w:r>
-        <w:t xml:space="preserve">Приступим к созданию репозитория на основе шаблона.</w:t>
-      </w:r>
-    </w:p>
-    <w:bookmarkStart w:id="31" w:name="X1d5781111d84f7b3fe45a0852e59758cd7a87e5"/>
-    <w:tbl>
-      <w:tblPr>
-        <w:tblStyle w:val="FigureTable"/>
-        <w:tblW w:type="auto" w:w="0"/>
-        <w:jc w:val="center"/>
-        <w:tblLook w:firstRow="0" w:lastRow="0" w:firstColumn="0" w:lastColumn="0"/>
-      </w:tblPr>
-      <w:tblGrid>
-        <w:gridCol w:w="7920"/>
-      </w:tblGrid>
-      <w:tr>
-        <w:tc>
-          <w:tcPr/>
-          <w:p>
-            <w:pPr>
-              <w:pStyle w:val="Compact"/>
-              <w:jc w:val="center"/>
-            </w:pPr>
-            <w:r>
-              <w:t xml:space="preserve">Создание репозитория курса.</w:t>
-            </w:r>
-          </w:p>
-        </w:tc>
-      </w:tr>
-    </w:tbl>
-    <w:p>
-      <w:pPr>
-        <w:pStyle w:val="ImageCaption"/>
-      </w:pPr>
-      <w:r>
-        <w:t xml:space="preserve">Создание репозитория курса.</w:t>
-      </w:r>
-    </w:p>
-    <w:bookmarkEnd w:id="31"/>
-    <w:p>
-      <w:pPr>
-        <w:pStyle w:val="BodyText"/>
-      </w:pPr>
-      <w:r>
-        <w:t xml:space="preserve">Настроим каталог курса.</w:t>
-      </w:r>
-    </w:p>
-    <w:bookmarkStart w:id="32" w:name="X7ba0791499db908433b80f37c5fbc89b870084b"/>
-    <w:tbl>
-      <w:tblPr>
-        <w:tblStyle w:val="FigureTable"/>
-        <w:tblW w:type="auto" w:w="0"/>
-        <w:jc w:val="center"/>
-        <w:tblLook w:firstRow="0" w:lastRow="0" w:firstColumn="0" w:lastColumn="0"/>
-      </w:tblPr>
-      <w:tblGrid>
-        <w:gridCol w:w="7920"/>
-      </w:tblGrid>
-      <w:tr>
-        <w:tc>
-          <w:tcPr/>
-          <w:p>
-            <w:pPr>
-              <w:pStyle w:val="Compact"/>
-              <w:jc w:val="center"/>
-            </w:pPr>
-            <w:r>
-              <w:t xml:space="preserve">Настройка каталога.</w:t>
-            </w:r>
-          </w:p>
-        </w:tc>
-      </w:tr>
-    </w:tbl>
-    <w:p>
-      <w:pPr>
-        <w:pStyle w:val="ImageCaption"/>
-      </w:pPr>
-      <w:r>
-        <w:t xml:space="preserve">Настройка каталога.</w:t>
-      </w:r>
-    </w:p>
-    <w:bookmarkEnd w:id="32"/>
-    <w:p>
-      <w:pPr>
-        <w:pStyle w:val="BodyText"/>
-      </w:pPr>
-      <w:r>
-        <w:t xml:space="preserve">Отправим файлы на сервер.</w:t>
-      </w:r>
-    </w:p>
-    <w:bookmarkStart w:id="36" w:name="Xb52009b64fd0a2a49e6d8a939753077792b0554"/>
+    <w:bookmarkStart w:id="46" w:name="X316b3d5fef9b3562d32f7c39f154a3bc3ab9c58"/>
     <w:p>
       <w:pPr>
         <w:pStyle w:val="CaptionedFigure"/>
@@ -623,20 +500,363 @@
       <w:r>
         <w:drawing>
           <wp:inline>
-            <wp:extent cx="3733800" cy="186246"/>
+            <wp:extent cx="3733800" cy="623328"/>
             <wp:effectExtent b="0" l="0" r="0" t="0"/>
-            <wp:docPr descr="Добавление файлов и создание коммита." title="" id="34" name="Picture"/>
+            <wp:docPr descr="Команда вывода списка ключей." title="" id="44" name="Picture"/>
             <a:graphic>
               <a:graphicData uri="http://schemas.openxmlformats.org/drawingml/2006/picture">
                 <pic:pic>
                   <pic:nvPicPr>
-                    <pic:cNvPr descr="image/Shot12.png" id="35" name="Picture"/>
+                    <pic:cNvPr descr="image/Shot06.png" id="45" name="Picture"/>
                     <pic:cNvPicPr>
                       <a:picLocks noChangeArrowheads="1" noChangeAspect="1"/>
                     </pic:cNvPicPr>
                   </pic:nvPicPr>
                   <pic:blipFill>
-                    <a:blip r:embed="rId33"/>
+                    <a:blip r:embed="rId43"/>
+                    <a:stretch>
+                      <a:fillRect/>
+                    </a:stretch>
+                  </pic:blipFill>
+                  <pic:spPr bwMode="auto">
+                    <a:xfrm>
+                      <a:off x="0" y="0"/>
+                      <a:ext cx="3733800" cy="623328"/>
+                    </a:xfrm>
+                    <a:prstGeom prst="rect">
+                      <a:avLst/>
+                    </a:prstGeom>
+                    <a:noFill/>
+                    <a:ln w="9525">
+                      <a:noFill/>
+                      <a:headEnd/>
+                      <a:tailEnd/>
+                    </a:ln>
+                  </pic:spPr>
+                </pic:pic>
+              </a:graphicData>
+            </a:graphic>
+          </wp:inline>
+        </w:drawing>
+      </w:r>
+    </w:p>
+    <w:p>
+      <w:pPr>
+        <w:pStyle w:val="ImageCaption"/>
+      </w:pPr>
+      <w:r>
+        <w:t xml:space="preserve">Команда вывода списка ключей.</w:t>
+      </w:r>
+    </w:p>
+    <w:bookmarkEnd w:id="46"/>
+    <w:p>
+      <w:pPr>
+        <w:pStyle w:val="BodyText"/>
+      </w:pPr>
+      <w:r>
+        <w:t xml:space="preserve">Скопируем ключ PGP с помощью</w:t>
+      </w:r>
+      <w:r>
+        <w:t xml:space="preserve"> </w:t>
+      </w:r>
+      <w:r>
+        <w:t xml:space="preserve">‘gpg –armor –export</w:t>
+      </w:r>
+      <w:r>
+        <w:t xml:space="preserve"> </w:t>
+      </w:r>
+      <w:r>
+        <w:t xml:space="preserve"> </w:t>
+      </w:r>
+      <w:r>
+        <w:t xml:space="preserve">| xclip -sel clip’</w:t>
+      </w:r>
+      <w:r>
+        <w:t xml:space="preserve">. Затем перейдём в настройки GitHub &gt; SSH and GPG keys &gt; New GPG key и вставим скопированный ключ.</w:t>
+      </w:r>
+    </w:p>
+    <w:bookmarkStart w:id="50" w:name="Xea51bf32497d1b3708522b430b288a129f65307"/>
+    <w:p>
+      <w:pPr>
+        <w:pStyle w:val="CaptionedFigure"/>
+      </w:pPr>
+      <w:r>
+        <w:drawing>
+          <wp:inline>
+            <wp:extent cx="3733800" cy="1868462"/>
+            <wp:effectExtent b="0" l="0" r="0" t="0"/>
+            <wp:docPr descr="Добавление ключа на GitHub." title="" id="48" name="Picture"/>
+            <a:graphic>
+              <a:graphicData uri="http://schemas.openxmlformats.org/drawingml/2006/picture">
+                <pic:pic>
+                  <pic:nvPicPr>
+                    <pic:cNvPr descr="image/Shot08.png" id="49" name="Picture"/>
+                    <pic:cNvPicPr>
+                      <a:picLocks noChangeArrowheads="1" noChangeAspect="1"/>
+                    </pic:cNvPicPr>
+                  </pic:nvPicPr>
+                  <pic:blipFill>
+                    <a:blip r:embed="rId47"/>
+                    <a:stretch>
+                      <a:fillRect/>
+                    </a:stretch>
+                  </pic:blipFill>
+                  <pic:spPr bwMode="auto">
+                    <a:xfrm>
+                      <a:off x="0" y="0"/>
+                      <a:ext cx="3733800" cy="1868462"/>
+                    </a:xfrm>
+                    <a:prstGeom prst="rect">
+                      <a:avLst/>
+                    </a:prstGeom>
+                    <a:noFill/>
+                    <a:ln w="9525">
+                      <a:noFill/>
+                      <a:headEnd/>
+                      <a:tailEnd/>
+                    </a:ln>
+                  </pic:spPr>
+                </pic:pic>
+              </a:graphicData>
+            </a:graphic>
+          </wp:inline>
+        </w:drawing>
+      </w:r>
+    </w:p>
+    <w:p>
+      <w:pPr>
+        <w:pStyle w:val="ImageCaption"/>
+      </w:pPr>
+      <w:r>
+        <w:t xml:space="preserve">Добавление ключа на GitHub.</w:t>
+      </w:r>
+    </w:p>
+    <w:bookmarkEnd w:id="50"/>
+    <w:p>
+      <w:pPr>
+        <w:pStyle w:val="BodyText"/>
+      </w:pPr>
+      <w:r>
+        <w:t xml:space="preserve">После добавления ключа настроим автоматические подписи коммитов. Укажем git применять наш email при подписи коммитов. После этого авторизуемся.</w:t>
+      </w:r>
+    </w:p>
+    <w:bookmarkStart w:id="54" w:name="Xb581cdce6283495fd4934ce574ac47e92881c64"/>
+    <w:p>
+      <w:pPr>
+        <w:pStyle w:val="CaptionedFigure"/>
+      </w:pPr>
+      <w:r>
+        <w:drawing>
+          <wp:inline>
+            <wp:extent cx="3733800" cy="1112346"/>
+            <wp:effectExtent b="0" l="0" r="0" t="0"/>
+            <wp:docPr descr="Автоматические подписи и авторизация." title="" id="52" name="Picture"/>
+            <a:graphic>
+              <a:graphicData uri="http://schemas.openxmlformats.org/drawingml/2006/picture">
+                <pic:pic>
+                  <pic:nvPicPr>
+                    <pic:cNvPr descr="image/Shot09.png" id="53" name="Picture"/>
+                    <pic:cNvPicPr>
+                      <a:picLocks noChangeArrowheads="1" noChangeAspect="1"/>
+                    </pic:cNvPicPr>
+                  </pic:nvPicPr>
+                  <pic:blipFill>
+                    <a:blip r:embed="rId51"/>
+                    <a:stretch>
+                      <a:fillRect/>
+                    </a:stretch>
+                  </pic:blipFill>
+                  <pic:spPr bwMode="auto">
+                    <a:xfrm>
+                      <a:off x="0" y="0"/>
+                      <a:ext cx="3733800" cy="1112346"/>
+                    </a:xfrm>
+                    <a:prstGeom prst="rect">
+                      <a:avLst/>
+                    </a:prstGeom>
+                    <a:noFill/>
+                    <a:ln w="9525">
+                      <a:noFill/>
+                      <a:headEnd/>
+                      <a:tailEnd/>
+                    </a:ln>
+                  </pic:spPr>
+                </pic:pic>
+              </a:graphicData>
+            </a:graphic>
+          </wp:inline>
+        </w:drawing>
+      </w:r>
+    </w:p>
+    <w:p>
+      <w:pPr>
+        <w:pStyle w:val="ImageCaption"/>
+      </w:pPr>
+      <w:r>
+        <w:t xml:space="preserve">Автоматические подписи и авторизация.</w:t>
+      </w:r>
+    </w:p>
+    <w:bookmarkEnd w:id="54"/>
+    <w:p>
+      <w:pPr>
+        <w:pStyle w:val="BodyText"/>
+      </w:pPr>
+      <w:r>
+        <w:t xml:space="preserve">Приступим к созданию репозитория на основе шаблона.</w:t>
+      </w:r>
+    </w:p>
+    <w:bookmarkStart w:id="58" w:name="X1d5781111d84f7b3fe45a0852e59758cd7a87e5"/>
+    <w:p>
+      <w:pPr>
+        <w:pStyle w:val="CaptionedFigure"/>
+      </w:pPr>
+      <w:r>
+        <w:drawing>
+          <wp:inline>
+            <wp:extent cx="3733800" cy="414512"/>
+            <wp:effectExtent b="0" l="0" r="0" t="0"/>
+            <wp:docPr descr="Создание репозитория курса." title="" id="56" name="Picture"/>
+            <a:graphic>
+              <a:graphicData uri="http://schemas.openxmlformats.org/drawingml/2006/picture">
+                <pic:pic>
+                  <pic:nvPicPr>
+                    <pic:cNvPr descr="image/Shot10.png" id="57" name="Picture"/>
+                    <pic:cNvPicPr>
+                      <a:picLocks noChangeArrowheads="1" noChangeAspect="1"/>
+                    </pic:cNvPicPr>
+                  </pic:nvPicPr>
+                  <pic:blipFill>
+                    <a:blip r:embed="rId55"/>
+                    <a:stretch>
+                      <a:fillRect/>
+                    </a:stretch>
+                  </pic:blipFill>
+                  <pic:spPr bwMode="auto">
+                    <a:xfrm>
+                      <a:off x="0" y="0"/>
+                      <a:ext cx="3733800" cy="414512"/>
+                    </a:xfrm>
+                    <a:prstGeom prst="rect">
+                      <a:avLst/>
+                    </a:prstGeom>
+                    <a:noFill/>
+                    <a:ln w="9525">
+                      <a:noFill/>
+                      <a:headEnd/>
+                      <a:tailEnd/>
+                    </a:ln>
+                  </pic:spPr>
+                </pic:pic>
+              </a:graphicData>
+            </a:graphic>
+          </wp:inline>
+        </w:drawing>
+      </w:r>
+    </w:p>
+    <w:p>
+      <w:pPr>
+        <w:pStyle w:val="ImageCaption"/>
+      </w:pPr>
+      <w:r>
+        <w:t xml:space="preserve">Создание репозитория курса.</w:t>
+      </w:r>
+    </w:p>
+    <w:bookmarkEnd w:id="58"/>
+    <w:p>
+      <w:pPr>
+        <w:pStyle w:val="BodyText"/>
+      </w:pPr>
+      <w:r>
+        <w:t xml:space="preserve">Настроим каталог курса.</w:t>
+      </w:r>
+    </w:p>
+    <w:bookmarkStart w:id="62" w:name="X7ba0791499db908433b80f37c5fbc89b870084b"/>
+    <w:p>
+      <w:pPr>
+        <w:pStyle w:val="CaptionedFigure"/>
+      </w:pPr>
+      <w:r>
+        <w:drawing>
+          <wp:inline>
+            <wp:extent cx="3733800" cy="445740"/>
+            <wp:effectExtent b="0" l="0" r="0" t="0"/>
+            <wp:docPr descr="Настройка каталога." title="" id="60" name="Picture"/>
+            <a:graphic>
+              <a:graphicData uri="http://schemas.openxmlformats.org/drawingml/2006/picture">
+                <pic:pic>
+                  <pic:nvPicPr>
+                    <pic:cNvPr descr="image/Shot11.png" id="61" name="Picture"/>
+                    <pic:cNvPicPr>
+                      <a:picLocks noChangeArrowheads="1" noChangeAspect="1"/>
+                    </pic:cNvPicPr>
+                  </pic:nvPicPr>
+                  <pic:blipFill>
+                    <a:blip r:embed="rId59"/>
+                    <a:stretch>
+                      <a:fillRect/>
+                    </a:stretch>
+                  </pic:blipFill>
+                  <pic:spPr bwMode="auto">
+                    <a:xfrm>
+                      <a:off x="0" y="0"/>
+                      <a:ext cx="3733800" cy="445740"/>
+                    </a:xfrm>
+                    <a:prstGeom prst="rect">
+                      <a:avLst/>
+                    </a:prstGeom>
+                    <a:noFill/>
+                    <a:ln w="9525">
+                      <a:noFill/>
+                      <a:headEnd/>
+                      <a:tailEnd/>
+                    </a:ln>
+                  </pic:spPr>
+                </pic:pic>
+              </a:graphicData>
+            </a:graphic>
+          </wp:inline>
+        </w:drawing>
+      </w:r>
+    </w:p>
+    <w:p>
+      <w:pPr>
+        <w:pStyle w:val="ImageCaption"/>
+      </w:pPr>
+      <w:r>
+        <w:t xml:space="preserve">Настройка каталога.</w:t>
+      </w:r>
+    </w:p>
+    <w:bookmarkEnd w:id="62"/>
+    <w:p>
+      <w:pPr>
+        <w:pStyle w:val="BodyText"/>
+      </w:pPr>
+      <w:r>
+        <w:t xml:space="preserve">Отправим файлы на сервер.</w:t>
+      </w:r>
+    </w:p>
+    <w:bookmarkStart w:id="66" w:name="Xb52009b64fd0a2a49e6d8a939753077792b0554"/>
+    <w:p>
+      <w:pPr>
+        <w:pStyle w:val="CaptionedFigure"/>
+      </w:pPr>
+      <w:r>
+        <w:drawing>
+          <wp:inline>
+            <wp:extent cx="3733800" cy="186246"/>
+            <wp:effectExtent b="0" l="0" r="0" t="0"/>
+            <wp:docPr descr="Добавление файлов и создание коммита." title="" id="64" name="Picture"/>
+            <a:graphic>
+              <a:graphicData uri="http://schemas.openxmlformats.org/drawingml/2006/picture">
+                <pic:pic>
+                  <pic:nvPicPr>
+                    <pic:cNvPr descr="image/Shot12.png" id="65" name="Picture"/>
+                    <pic:cNvPicPr>
+                      <a:picLocks noChangeArrowheads="1" noChangeAspect="1"/>
+                    </pic:cNvPicPr>
+                  </pic:nvPicPr>
+                  <pic:blipFill>
+                    <a:blip r:embed="rId63"/>
                     <a:stretch>
                       <a:fillRect/>
                     </a:stretch>
@@ -671,33 +891,55 @@
         <w:t xml:space="preserve">Добавление файлов и создание коммита.</w:t>
       </w:r>
     </w:p>
-    <w:bookmarkEnd w:id="36"/>
-    <w:bookmarkStart w:id="37" w:name="Xd307a3ec329e10a2cff8fb87480823da114f8f4"/>
-    <w:tbl>
-      <w:tblPr>
-        <w:tblStyle w:val="FigureTable"/>
-        <w:tblW w:type="auto" w:w="0"/>
-        <w:jc w:val="center"/>
-        <w:tblLook w:firstRow="0" w:lastRow="0" w:firstColumn="0" w:lastColumn="0"/>
-      </w:tblPr>
-      <w:tblGrid>
-        <w:gridCol w:w="7920"/>
-      </w:tblGrid>
-      <w:tr>
-        <w:tc>
-          <w:tcPr/>
-          <w:p>
-            <w:pPr>
-              <w:pStyle w:val="Compact"/>
-              <w:jc w:val="center"/>
-            </w:pPr>
-            <w:r>
-              <w:t xml:space="preserve">Отправка файлов на сервер GitHub.</w:t>
-            </w:r>
-          </w:p>
-        </w:tc>
-      </w:tr>
-    </w:tbl>
+    <w:bookmarkEnd w:id="66"/>
+    <w:bookmarkStart w:id="70" w:name="Xd307a3ec329e10a2cff8fb87480823da114f8f4"/>
+    <w:p>
+      <w:pPr>
+        <w:pStyle w:val="CaptionedFigure"/>
+      </w:pPr>
+      <w:r>
+        <w:drawing>
+          <wp:inline>
+            <wp:extent cx="3733800" cy="1365393"/>
+            <wp:effectExtent b="0" l="0" r="0" t="0"/>
+            <wp:docPr descr="Отправка файлов на сервер GitHub." title="" id="68" name="Picture"/>
+            <a:graphic>
+              <a:graphicData uri="http://schemas.openxmlformats.org/drawingml/2006/picture">
+                <pic:pic>
+                  <pic:nvPicPr>
+                    <pic:cNvPr descr="image/Shot13.png" id="69" name="Picture"/>
+                    <pic:cNvPicPr>
+                      <a:picLocks noChangeArrowheads="1" noChangeAspect="1"/>
+                    </pic:cNvPicPr>
+                  </pic:nvPicPr>
+                  <pic:blipFill>
+                    <a:blip r:embed="rId67"/>
+                    <a:stretch>
+                      <a:fillRect/>
+                    </a:stretch>
+                  </pic:blipFill>
+                  <pic:spPr bwMode="auto">
+                    <a:xfrm>
+                      <a:off x="0" y="0"/>
+                      <a:ext cx="3733800" cy="1365393"/>
+                    </a:xfrm>
+                    <a:prstGeom prst="rect">
+                      <a:avLst/>
+                    </a:prstGeom>
+                    <a:noFill/>
+                    <a:ln w="9525">
+                      <a:noFill/>
+                      <a:headEnd/>
+                      <a:tailEnd/>
+                    </a:ln>
+                  </pic:spPr>
+                </pic:pic>
+              </a:graphicData>
+            </a:graphic>
+          </wp:inline>
+        </w:drawing>
+      </w:r>
+    </w:p>
     <w:p>
       <w:pPr>
         <w:pStyle w:val="ImageCaption"/>
@@ -706,9 +948,9 @@
         <w:t xml:space="preserve">Отправка файлов на сервер GitHub.</w:t>
       </w:r>
     </w:p>
-    <w:bookmarkEnd w:id="37"/>
-    <w:bookmarkEnd w:id="38"/>
-    <w:bookmarkStart w:id="39" w:name="выводы"/>
+    <w:bookmarkEnd w:id="70"/>
+    <w:bookmarkEnd w:id="71"/>
+    <w:bookmarkStart w:id="72" w:name="выводы"/>
     <w:p>
       <w:pPr>
         <w:pStyle w:val="Heading1"/>
@@ -725,8 +967,8 @@
         <w:t xml:space="preserve">В результате проделанной работы мы освоили базовые навыки работы с git и создали репозиторий курса на GitHub.</w:t>
       </w:r>
     </w:p>
-    <w:bookmarkEnd w:id="39"/>
-    <w:bookmarkStart w:id="41" w:name="список-литературы"/>
+    <w:bookmarkEnd w:id="72"/>
+    <w:bookmarkStart w:id="74" w:name="список-литературы"/>
     <w:p>
       <w:pPr>
         <w:pStyle w:val="Heading1"/>
@@ -743,7 +985,7 @@
           <w:numId w:val="1001"/>
         </w:numPr>
       </w:pPr>
-      <w:hyperlink r:id="rId40">
+      <w:hyperlink r:id="rId73">
         <w:r>
           <w:rPr>
             <w:rStyle w:val="Hyperlink"/>
@@ -752,7 +994,7 @@
         </w:r>
       </w:hyperlink>
     </w:p>
-    <w:bookmarkEnd w:id="41"/>
+    <w:bookmarkEnd w:id="74"/>
     <w:sectPr>
       <w:footnotePr>
         <w:numRestart w:val="eachSect"/>

</xml_diff>